<commit_message>
Corrección nombre de Andrez
</commit_message>
<xml_diff>
--- a/documents/avance2_informe_grupo10.docx
+++ b/documents/avance2_informe_grupo10.docx
@@ -15,7 +15,21 @@
           <w:rFonts w:ascii="Times New Roman" w:hAnsi="Times New Roman" w:cs="Times New Roman"/>
           <w:lang w:val="es-ES"/>
         </w:rPr>
-        <w:t>Francisco Soler, Andrés Guerrero, Julio Alejandro Gómez, Mariana Villabona Martínez.</w:t>
+        <w:t>Francisco Soler, André</w:t>
+      </w:r>
+      <w:r>
+        <w:rPr>
+          <w:rFonts w:ascii="Times New Roman" w:hAnsi="Times New Roman" w:cs="Times New Roman"/>
+          <w:lang w:val="es-ES"/>
+        </w:rPr>
+        <w:t>z</w:t>
+      </w:r>
+      <w:r>
+        <w:rPr>
+          <w:rFonts w:ascii="Times New Roman" w:hAnsi="Times New Roman" w:cs="Times New Roman"/>
+          <w:lang w:val="es-ES"/>
+        </w:rPr>
+        <w:t xml:space="preserve"> Guerrero, Julio Alejandro Gómez, Mariana Villabona Martínez.</w:t>
       </w:r>
     </w:p>
     <w:p>
@@ -107,40 +121,16 @@
           <w:rFonts w:ascii="Times New Roman" w:hAnsi="Times New Roman" w:cs="Times New Roman"/>
           <w:lang w:val="es-ES"/>
         </w:rPr>
-        <w:t xml:space="preserve">Desde el avance #1 se ha realizado una investigación exhaustiva del repositorio original del </w:t>
-      </w:r>
-      <w:proofErr w:type="spellStart"/>
-      <w:r>
-        <w:rPr>
-          <w:rFonts w:ascii="Times New Roman" w:hAnsi="Times New Roman" w:cs="Times New Roman"/>
-          <w:lang w:val="es-ES"/>
-        </w:rPr>
-        <w:t>paper</w:t>
-      </w:r>
-      <w:proofErr w:type="spellEnd"/>
-      <w:r>
-        <w:rPr>
-          <w:rFonts w:ascii="Times New Roman" w:hAnsi="Times New Roman" w:cs="Times New Roman"/>
-          <w:lang w:val="es-ES"/>
-        </w:rPr>
-        <w:t>, lo que permitió comprender en detalle su estructura y funcionamiento. A partir de ello, se diagramó el pipeline completo del proyecto</w:t>
-      </w:r>
-      <w:r>
-        <w:rPr>
-          <w:rFonts w:ascii="Times New Roman" w:hAnsi="Times New Roman" w:cs="Times New Roman"/>
-          <w:lang w:val="es-ES"/>
-        </w:rPr>
-        <w:t xml:space="preserve"> (vía </w:t>
-      </w:r>
-      <w:proofErr w:type="spellStart"/>
-      <w:r>
-        <w:rPr>
-          <w:rFonts w:ascii="Times New Roman" w:hAnsi="Times New Roman" w:cs="Times New Roman"/>
-          <w:lang w:val="es-ES"/>
-        </w:rPr>
-        <w:t>mermaid</w:t>
-      </w:r>
-      <w:proofErr w:type="spellEnd"/>
+        <w:t>Desde el avance #1 se ha realizado una investigación exhaustiva del repositorio original del paper, lo que permitió comprender en detalle su estructura y funcionamiento. A partir de ello, se diagramó el pipeline completo del proyecto</w:t>
+      </w:r>
+      <w:r>
+        <w:rPr>
+          <w:rFonts w:ascii="Times New Roman" w:hAnsi="Times New Roman" w:cs="Times New Roman"/>
+          <w:lang w:val="es-ES"/>
+        </w:rPr>
+        <w:t xml:space="preserve"> (vía mermaid</w:t>
+      </w:r>
+      <w:proofErr w:type="gramStart"/>
       <w:r>
         <w:rPr>
           <w:rFonts w:ascii="Times New Roman" w:hAnsi="Times New Roman" w:cs="Times New Roman"/>
@@ -153,7 +143,15 @@
           <w:rFonts w:ascii="Times New Roman" w:hAnsi="Times New Roman" w:cs="Times New Roman"/>
           <w:lang w:val="es-ES"/>
         </w:rPr>
-        <w:t>, incluyendo la composición del repositorio, la configuración del entorno computacional y la consolidación de la base de datos necesaria para ejecutar los scripts de análisis econométricos.</w:t>
+        <w:t>,</w:t>
+      </w:r>
+      <w:proofErr w:type="gramEnd"/>
+      <w:r>
+        <w:rPr>
+          <w:rFonts w:ascii="Times New Roman" w:hAnsi="Times New Roman" w:cs="Times New Roman"/>
+          <w:lang w:val="es-ES"/>
+        </w:rPr>
+        <w:t xml:space="preserve"> incluyendo la composición del repositorio, la configuración del entorno computacional y la consolidación de la base de datos necesaria para ejecutar los scripts de análisis econométricos.</w:t>
       </w:r>
     </w:p>
     <w:p>
@@ -184,23 +182,7 @@
           <w:rFonts w:ascii="Times New Roman" w:hAnsi="Times New Roman" w:cs="Times New Roman"/>
           <w:lang w:val="es-ES"/>
         </w:rPr>
-        <w:t xml:space="preserve"> (consolidación del </w:t>
-      </w:r>
-      <w:proofErr w:type="spellStart"/>
-      <w:r>
-        <w:rPr>
-          <w:rFonts w:ascii="Times New Roman" w:hAnsi="Times New Roman" w:cs="Times New Roman"/>
-          <w:lang w:val="es-ES"/>
-        </w:rPr>
-        <w:t>dataset</w:t>
-      </w:r>
-      <w:proofErr w:type="spellEnd"/>
-      <w:r>
-        <w:rPr>
-          <w:rFonts w:ascii="Times New Roman" w:hAnsi="Times New Roman" w:cs="Times New Roman"/>
-          <w:lang w:val="es-ES"/>
-        </w:rPr>
-        <w:t xml:space="preserve">) y el </w:t>
+        <w:t xml:space="preserve"> (consolidación del dataset) y el </w:t>
       </w:r>
       <w:r>
         <w:rPr>
@@ -225,6 +207,7 @@
           <w:rFonts w:ascii="Times New Roman" w:hAnsi="Times New Roman" w:cs="Times New Roman"/>
           <w:b/>
           <w:bCs/>
+          <w:lang w:val="es-ES"/>
         </w:rPr>
       </w:pPr>
       <w:r>
@@ -985,6 +968,7 @@
   <w:style w:type="character" w:default="1" w:styleId="DefaultParagraphFont">
     <w:name w:val="Default Paragraph Font"/>
     <w:uiPriority w:val="1"/>
+    <w:semiHidden/>
     <w:unhideWhenUsed/>
   </w:style>
   <w:style w:type="table" w:default="1" w:styleId="TableNormal">

</xml_diff>